<commit_message>
fix(reframe_ehpm_r3): replace snippets within runs instead of overwriting whole runs
Co-Authored-By: Tatsuki Onishi <bougtoir@gmail.com>
</commit_message>
<xml_diff>
--- a/healthcare_economic_effect/output/docx/Healthcare_EHPM_Manuscript_R3.docx
+++ b/healthcare_economic_effect/output/docx/Healthcare_EHPM_Manuscript_R3.docx
@@ -654,7 +654,7 @@
     </w:p>
     <w:p>
       <w:r>
-        <w:t>The tempo model tests for a constant spending-to-outcome lag in health-capital accumulation. To address the reproducibility concern raised in the previous round, the model, the underlying World Bank data, and the model-selection computation (level RMSE, change RMSE, leave-one-out cross-validation [LOOCV] RMSE, AIC, and BIC) are all provided in this study's public repository, so the framework can be reproduced and examined independently.</w:t>
+        <w:t>The tempo model tests for a constant spending-to-outcome lag in health-capital accumulation. To address the reproducibility concern raised in the previous round, the model, the underlying World Bank data, and the model-selection computation (level RMSE, change RMSE, leave-one-out cross-validation [LOOCV] RMSE, AIC, and BIC) are all provided in this study's public repository, so the framework can be reproduced and examined independently. The model treats health expenditure as a stock-building flow and regresses life expectancy on the log health-capital stock, controlling for income:</w:t>
       </w:r>
     </w:p>
     <w:p>
@@ -5258,7 +5258,7 @@
     </w:p>
     <w:p>
       <w:r>
-        <w:t>Finally, this study focused on the demand-side fiscal return; a comprehensive sustainability assessment would also need to quantify the economic returns to supply-side health-capital effects, which requires individual-level data.</w:t>
+        <w:t>Several further limitations should be noted. First, I-O multipliers are static models that do not account for price adjustments, supply constraints, or general equilibrium effects. Second, the effective tax rate parameter may not fully capture the complexity of national tax systems. Third, import leakage was calculated using aggregate HS trade data and does not capture re-exports or domestic value-added content of imports. Fourth, the counterfactual scenarios are static partial-equilibrium models. Fifth, the tempo model's time-varying component (M2) does not robustly survive parsimony-aware model selection. Finally, this study focused on the demand-side fiscal return; a comprehensive sustainability assessment would also need to quantify the economic returns to supply-side health-capital effects, which requires individual-level data.</w:t>
       </w:r>
     </w:p>
     <w:p>

</xml_diff>

<commit_message>
R3 final check: shorten abstract to ≤350 words, update word count, add verification script
Co-Authored-By: Tatsuki Onishi <bougtoir@gmail.com>
</commit_message>
<xml_diff>
--- a/healthcare_economic_effect/output/docx/Healthcare_EHPM_Manuscript_R3.docx
+++ b/healthcare_economic_effect/output/docx/Healthcare_EHPM_Manuscript_R3.docx
@@ -77,7 +77,7 @@
         <w:t xml:space="preserve">Total word count: </w:t>
       </w:r>
       <w:r>
-        <w:t>approximately 7,800 words (Text, References, Tables, and Figure Legends)</w:t>
+        <w:t>approximately 7,400 words (Text, References, Tables, and Figure Legends)</w:t>
       </w:r>
     </w:p>
     <w:p/>
@@ -124,7 +124,7 @@
         <w:t xml:space="preserve">Background: </w:t>
       </w:r>
       <w:r>
-        <w:t>Japan's healthcare expenditure (11.0% of GDP) is conventionally treated as a fiscal cost to be contained, particularly given rapid population aging. However, healthcare is also a major economic sector whose demand-side fiscal return is rarely quantified against its public cost. This study evaluates the fiscal return to Japan's healthcare expenditure using input-output (I-O) multipliers, tests for a constant spending-to-outcome lag in health-capital accumulation, and benchmarks the pattern across 13 OECD countries.</w:t>
+        <w:t>Japan's healthcare expenditure (11.0% of GDP) is conventionally treated as a fiscal cost. This study evaluates its demand-side fiscal return using input-output (I-O) multipliers, tests for a constant spending-to-outcome lag in health-capital accumulation, and benchmarks Japan against 12 other OECD countries.</w:t>
       </w:r>
     </w:p>
     <w:p>
@@ -135,7 +135,7 @@
         <w:t xml:space="preserve">Methods: </w:t>
       </w:r>
       <w:r>
-        <w:t>We compiled healthcare sector I-O output multipliers for 13 OECD countries from published national and EU-28 framework studies. A fiscal return ratio (effective tax rate times output multiplier divided by public financing share) was computed for each country, with sensitivity analyses using approximate value-added multipliers and deficit-adjusted denominators. A self-contained tempo model (39 countries, 2000-2019) tested for a constant spending-to-outcome lag in health-capital accumulation; model selection used LOOCV RMSE, AIC, and BIC. Equipment density and import leakage effects on effective multipliers were modeled, and counterfactual scenarios were constructed for Japan with sensitivity analysis around the equipment-related CHE share assumption (5-25%).</w:t>
+        <w:t>We compiled healthcare sector I-O output multipliers for 13 OECD countries and computed a fiscal return ratio (effective tax rate times output multiplier divided by public financing share), with sensitivity analyses for import leakage, approximate value-added multipliers, and 35% deficit financing. A self-contained tempo model (39 countries, 2000-2019) tested for a constant spending-to-outcome lag using RMSE, AIC, BIC, and LOOCV.</w:t>
       </w:r>
     </w:p>
     <w:p>
@@ -146,7 +146,7 @@
         <w:t xml:space="preserve">Results: </w:t>
       </w:r>
       <w:r>
-        <w:t>Using output multipliers, the demand-side fiscal return ratio exceeded 1.0 in five of thirteen countries (France 1.18, Italy 1.13, Japan 1.09, Sweden 1.04, Finland 1.04). With value-added multipliers, no country exceeded 1.0, indicating that the output multiplier provides an upper bound. For Japan the ratio fell from 1.09 (gross) to 1.04 after import-leakage adjustment, to 0.67 when the return was discounted for 35% deficit financing, and to 0.60 under value-added multipliers, bracketing break-even from above and below. Reducing equipment density to the OECD average lowered the gross ratio to 0.98 (sensitivity range 0.94-1.02 for equipment share 5-25%). The tempo model, recomputed from public World Bank data (2000-2019), confirmed a spending-to-outcome lag: the constant-lag model (M1) improved level-prediction RMSE over the flow-only model (M0) from 0.253 to 0.208 years and LOOCV RMSE from 0.304 to 0.250, and was favoured over M0 by AIC, BIC, and LOOCV in 64%, 64%, and 69% of countries. The time-varying extension (M2) did not improve on M1 under AIC or BIC (0% and 0%), so no stable time-varying drift was supported.</w:t>
+        <w:t>Using output multipliers, the demand-side fiscal return ratio exceeded 1.0 in five of thirteen countries (France 1.18, Italy 1.13, Japan 1.09, Sweden 1.04, Finland 1.04). With value-added multipliers, no country exceeded 1.0. For Japan the ratio fell from 1.09 (gross) to 1.04 after import-leakage adjustment, 0.67 after discounting for 35% deficit financing, and 0.60 under value-added multipliers, bracketing break-even. The equipment-density counterfactual lowered the gross ratio to 0.98 (sensitivity range 0.94-1.02 for equipment share 5-25%). The tempo model confirmed a constant spending-to-outcome lag of approximately 2 years; the time-varying extension was not supported by AIC or BIC.</w:t>
       </w:r>
     </w:p>
     <w:p>
@@ -157,7 +157,7 @@
         <w:t xml:space="preserve">Conclusions: </w:t>
       </w:r>
       <w:r>
-        <w:t>Japan's healthcare expenditure generates a material, conditional demand-side fiscal return: the gross output-multiplier return is 1.09, the import-leakage-adjusted return is 1.04, the deficit-adjusted return is 0.67, and the value-added return is 0.60, bracketing break-even from above and below. The return is comparable in magnitude to other discretionary fiscal expenditures, but it is not by itself sufficient to fully self-finance public healthcare costs under conservative treatments. The tempo model supports a constant spending-to-outcome lag of approximately 2 years, not a time-varying drift. The policy implication is that healthcare expenditure should be evaluated with both cost and economic-return lenses, with deficit-financing dependence, equipment utilization, workforce constraints, and cross-country heterogeneity treated as boundary conditions on the sustainability of that return rather than as grounds for dismissing it.</w:t>
+        <w:t>Japan's healthcare expenditure generates a material, conditional demand-side fiscal return that brackets break-even. The return is not sufficient for full tax-based self-financing under conservative treatments. Cross-country comparison shows Japan is not an outlier: gross output-multiplier returns exceed break-even in five OECD countries, while value-added and deficit-adjusted returns fall below it. Healthcare spending should be evaluated with both cost and economic-return lenses, treating financing structure and cross-country heterogeneity as boundary conditions.</w:t>
       </w:r>
     </w:p>
     <w:p/>

</xml_diff>